<commit_message>
Day8-RagAgent: guard against empty knowledge base, add project.md
bestMatch could be null if the knowledge base were ever empty, and the
code dereferenced bestMatch.Text a few lines later with no check - add
a guard so that case prints a friendly message instead of crashing with
a raw NullReferenceException. Syncs the docx's Complete Code listing to
match and replaces missing.md with project.md.
</commit_message>
<xml_diff>
--- a/Day8-RagAgent.docx
+++ b/Day8-RagAgent.docx
@@ -1362,6 +1362,143 @@
           <w:rFonts w:ascii="Consolas" w:hAnsi="Consolas"/>
           <w:sz w:val="19"/>
         </w:rPr>
+        <w:t xml:space="preserve">            // Step 7b: Guard against an empty/missing knowledge base. Without this,</w:t>
+      </w:r>
+    </w:p>
+    <w:p>
+      <w:pPr>
+        <w:pStyle w:val="NoSpacing"/>
+        <w:rPr>
+          <w:rFonts w:ascii="Consolas" w:hAnsi="Consolas"/>
+          <w:sz w:val="19"/>
+        </w:rPr>
+      </w:pPr>
+      <w:r>
+        <w:rPr>
+          <w:rFonts w:ascii="Consolas" w:hAnsi="Consolas"/>
+          <w:sz w:val="19"/>
+        </w:rPr>
+        <w:t xml:space="preserve">            // a null bestMatch would crash a few lines below with a raw</w:t>
+      </w:r>
+    </w:p>
+    <w:p>
+      <w:pPr>
+        <w:pStyle w:val="NoSpacing"/>
+        <w:rPr>
+          <w:rFonts w:ascii="Consolas" w:hAnsi="Consolas"/>
+          <w:sz w:val="19"/>
+        </w:rPr>
+      </w:pPr>
+      <w:r>
+        <w:rPr>
+          <w:rFonts w:ascii="Consolas" w:hAnsi="Consolas"/>
+          <w:sz w:val="19"/>
+        </w:rPr>
+        <w:t xml:space="preserve">            // NullReferenceException instead of a clear, friendly message.</w:t>
+      </w:r>
+    </w:p>
+    <w:p>
+      <w:pPr>
+        <w:pStyle w:val="NoSpacing"/>
+        <w:rPr>
+          <w:rFonts w:ascii="Consolas" w:hAnsi="Consolas"/>
+          <w:sz w:val="19"/>
+        </w:rPr>
+      </w:pPr>
+      <w:r>
+        <w:rPr>
+          <w:rFonts w:ascii="Consolas" w:hAnsi="Consolas"/>
+          <w:sz w:val="19"/>
+        </w:rPr>
+        <w:t xml:space="preserve">            if (bestMatch is null)</w:t>
+      </w:r>
+    </w:p>
+    <w:p>
+      <w:pPr>
+        <w:pStyle w:val="NoSpacing"/>
+        <w:rPr>
+          <w:rFonts w:ascii="Consolas" w:hAnsi="Consolas"/>
+          <w:sz w:val="19"/>
+        </w:rPr>
+      </w:pPr>
+      <w:r>
+        <w:rPr>
+          <w:rFonts w:ascii="Consolas" w:hAnsi="Consolas"/>
+          <w:sz w:val="19"/>
+        </w:rPr>
+        <w:t xml:space="preserve">            {</w:t>
+      </w:r>
+    </w:p>
+    <w:p>
+      <w:pPr>
+        <w:pStyle w:val="NoSpacing"/>
+        <w:rPr>
+          <w:rFonts w:ascii="Consolas" w:hAnsi="Consolas"/>
+          <w:sz w:val="19"/>
+        </w:rPr>
+      </w:pPr>
+      <w:r>
+        <w:rPr>
+          <w:rFonts w:ascii="Consolas" w:hAnsi="Consolas"/>
+          <w:sz w:val="19"/>
+        </w:rPr>
+        <w:t xml:space="preserve">                Console.WriteLine("No knowledge base documents are available to answer this question.");</w:t>
+      </w:r>
+    </w:p>
+    <w:p>
+      <w:pPr>
+        <w:pStyle w:val="NoSpacing"/>
+        <w:rPr>
+          <w:rFonts w:ascii="Consolas" w:hAnsi="Consolas"/>
+          <w:sz w:val="19"/>
+        </w:rPr>
+      </w:pPr>
+      <w:r>
+        <w:rPr>
+          <w:rFonts w:ascii="Consolas" w:hAnsi="Consolas"/>
+          <w:sz w:val="19"/>
+        </w:rPr>
+        <w:t xml:space="preserve">                return;</w:t>
+      </w:r>
+    </w:p>
+    <w:p>
+      <w:pPr>
+        <w:pStyle w:val="NoSpacing"/>
+        <w:rPr>
+          <w:rFonts w:ascii="Consolas" w:hAnsi="Consolas"/>
+          <w:sz w:val="19"/>
+        </w:rPr>
+      </w:pPr>
+      <w:r>
+        <w:rPr>
+          <w:rFonts w:ascii="Consolas" w:hAnsi="Consolas"/>
+          <w:sz w:val="19"/>
+        </w:rPr>
+        <w:t xml:space="preserve">            }</w:t>
+      </w:r>
+    </w:p>
+    <w:p>
+      <w:pPr>
+        <w:pStyle w:val="NoSpacing"/>
+        <w:rPr>
+          <w:rFonts w:ascii="Consolas" w:hAnsi="Consolas"/>
+          <w:sz w:val="19"/>
+        </w:rPr>
+      </w:pPr>
+    </w:p>
+    <w:p>
+      <w:pPr>
+        <w:pStyle w:val="NoSpacing"/>
+        <w:rPr>
+          <w:rFonts w:ascii="Consolas" w:hAnsi="Consolas"/>
+          <w:sz w:val="19"/>
+        </w:rPr>
+      </w:pPr>
+      <w:r>
+        <w:rPr>
+          <w:rFonts w:ascii="Consolas" w:hAnsi="Consolas"/>
+          <w:sz w:val="19"/>
+        </w:rPr>
         <w:t xml:space="preserve">            // Step 8: Build the RAG prompt</w:t>
       </w:r>
     </w:p>
@@ -1768,6 +1905,7 @@
           <w:rFonts w:ascii="Consolas" w:hAnsi="Consolas"/>
           <w:sz w:val="19"/>
         </w:rPr>
+        <w:lastRenderedPageBreak/>
         <w:t xml:space="preserve">            Console.WriteLine(result.ToString().Trim());</w:t>
       </w:r>
     </w:p>
@@ -2157,7 +2295,11 @@
         <w:t>Step 3: Building the Knowledge Base.</w:t>
       </w:r>
       <w:r>
-        <w:t xml:space="preserve"> The `foreach` loop calls `embeddingService.GenerateVectorAsync(text)` for each of the five company-policy strings, converting the entire knowledge base into a list of `KnowledgeDocument` objects with vectors attached. This "offline" indexing step is conceptually identical to what happens when documents are uploaded to a real vector store — just done here in memory, synchronously, for a handful of strings.</w:t>
+        <w:t xml:space="preserve"> The `foreach` loop calls `embeddingService.GenerateVectorAsync(text)` for each of the five company-policy strings, converting the entire knowledge base into a list of `KnowledgeDocument` objects with vectors attached. This "offline" indexing step is conceptually identical to what </w:t>
+      </w:r>
+      <w:r>
+        <w:lastRenderedPageBreak/>
+        <w:t>happens when documents are uploaded to a real vector store — just done here in memory, synchronously, for a handful of strings.</w:t>
       </w:r>
     </w:p>
     <w:p/>

</xml_diff>